<commit_message>
Sync to latest: Cloud Shell support, review fixes, cleanup
</commit_message>
<xml_diff>
--- a/docs/participant-workbook-session1.docx
+++ b/docs/participant-workbook-session1.docx
@@ -293,13 +293,28 @@
         <w:t xml:space="preserve"> </w:t>
       </w:r>
       <w:r>
-        <w:t xml:space="preserve">(e.g. </w:t>
-      </w:r>
-      <w:r>
-        <w:rPr>
-          <w:rStyle w:val="VerbatimChar"/>
-        </w:rPr>
-        <w:t xml:space="preserve">azflabphp4x4o7s4pa6</w:t>
+        <w:t xml:space="preserve">(it looks like</w:t>
+      </w:r>
+      <w:r>
+        <w:t xml:space="preserve"> </w:t>
+      </w:r>
+      <w:r>
+        <w:rPr>
+          <w:rStyle w:val="VerbatimChar"/>
+        </w:rPr>
+        <w:t xml:space="preserve">azflab</w:t>
+      </w:r>
+      <w:r>
+        <w:t xml:space="preserve"> </w:t>
+      </w:r>
+      <w:r>
+        <w:t xml:space="preserve">+ a random suffix, e.g. </w:t>
+      </w:r>
+      <w:r>
+        <w:rPr>
+          <w:rStyle w:val="VerbatimChar"/>
+        </w:rPr>
+        <w:t xml:space="preserve">azflababcd1234efgh</w:t>
       </w:r>
       <w:r>
         <w:t xml:space="preserve">).</w:t>
@@ -547,7 +562,67 @@
         <w:pStyle w:val="Compact"/>
       </w:pPr>
       <w:r>
-        <w:t xml:space="preserve">PowerShell 7+ with the Az module:</w:t>
+        <w:t xml:space="preserve">Where you’ll run the deploy/fault commands — pick one:</w:t>
+      </w:r>
+    </w:p>
+    <w:p>
+      <w:pPr>
+        <w:numPr>
+          <w:ilvl w:val="1"/>
+          <w:numId w:val="1003"/>
+        </w:numPr>
+        <w:pStyle w:val="Compact"/>
+      </w:pPr>
+      <w:r>
+        <w:rPr>
+          <w:b/>
+        </w:rPr>
+        <w:t xml:space="preserve">Azure Cloud Shell (easiest):</w:t>
+      </w:r>
+      <w:r>
+        <w:t xml:space="preserve"> </w:t>
+      </w:r>
+      <w:r>
+        <w:t xml:space="preserve">nothing to install — Az and Microsoft.Graph</w:t>
+      </w:r>
+      <w:r>
+        <w:t xml:space="preserve"> </w:t>
+      </w:r>
+      <w:r>
+        <w:t xml:space="preserve">are already there, and there’s no execution-policy /</w:t>
+      </w:r>
+      <w:r>
+        <w:t xml:space="preserve"> </w:t>
+      </w:r>
+      <w:r>
+        <w:t xml:space="preserve">“</w:t>
+      </w:r>
+      <w:r>
+        <w:t xml:space="preserve">unblock</w:t>
+      </w:r>
+      <w:r>
+        <w:t xml:space="preserve">”</w:t>
+      </w:r>
+      <w:r>
+        <w:t xml:space="preserve"> </w:t>
+      </w:r>
+      <w:r>
+        <w:t xml:space="preserve">friction.</w:t>
+      </w:r>
+    </w:p>
+    <w:p>
+      <w:pPr>
+        <w:numPr>
+          <w:ilvl w:val="1"/>
+          <w:numId w:val="1003"/>
+        </w:numPr>
+        <w:pStyle w:val="Compact"/>
+      </w:pPr>
+      <w:r>
+        <w:rPr>
+          <w:b/>
+        </w:rPr>
+        <w:t xml:space="preserve">Local PowerShell 7+:</w:t>
       </w:r>
       <w:r>
         <w:t xml:space="preserve"> </w:t>
@@ -557,6 +632,9 @@
           <w:rStyle w:val="VerbatimChar"/>
         </w:rPr>
         <w:t xml:space="preserve">Install-Module Az -Scope CurrentUser</w:t>
+      </w:r>
+      <w:r>
+        <w:t xml:space="preserve">.</w:t>
       </w:r>
     </w:p>
     <w:p>
@@ -568,13 +646,46 @@
         <w:pStyle w:val="Compact"/>
       </w:pPr>
       <w:r>
-        <w:t xml:space="preserve">An RDP client, connected to your Azure VPN (RDP is allowed from the AzureCloud</w:t>
-      </w:r>
-      <w:r>
-        <w:t xml:space="preserve"> </w:t>
-      </w:r>
-      <w:r>
-        <w:t xml:space="preserve">service tag).</w:t>
+        <w:t xml:space="preserve">An</w:t>
+      </w:r>
+      <w:r>
+        <w:t xml:space="preserve"> </w:t>
+      </w:r>
+      <w:r>
+        <w:rPr>
+          <w:b/>
+        </w:rPr>
+        <w:t xml:space="preserve">RDP client</w:t>
+      </w:r>
+      <w:r>
+        <w:t xml:space="preserve">, connected to your Azure VPN (RDP is allowed from the</w:t>
+      </w:r>
+      <w:r>
+        <w:t xml:space="preserve"> </w:t>
+      </w:r>
+      <w:r>
+        <w:t xml:space="preserve">AzureCloud service tag).</w:t>
+      </w:r>
+      <w:r>
+        <w:t xml:space="preserve"> </w:t>
+      </w:r>
+      <w:r>
+        <w:rPr>
+          <w:i/>
+        </w:rPr>
+        <w:t xml:space="preserve">Required either way</w:t>
+      </w:r>
+      <w:r>
+        <w:t xml:space="preserve"> </w:t>
+      </w:r>
+      <w:r>
+        <w:t xml:space="preserve">— the klist / net use / mount</w:t>
+      </w:r>
+      <w:r>
+        <w:t xml:space="preserve"> </w:t>
+      </w:r>
+      <w:r>
+        <w:t xml:space="preserve">steps happen inside the VMs, which Cloud Shell can’t do.</w:t>
       </w:r>
     </w:p>
     <w:p>
@@ -583,6 +694,131 @@
       </w:pPr>
       <w:r>
         <w:t xml:space="preserve">No Bicep CLI required.</w:t>
+      </w:r>
+    </w:p>
+    <w:p>
+      <w:pPr>
+        <w:pStyle w:val="BlockText"/>
+      </w:pPr>
+      <w:r>
+        <w:rPr>
+          <w:b/>
+        </w:rPr>
+        <w:t xml:space="preserve">Running in Cloud Shell?</w:t>
+      </w:r>
+      <w:r>
+        <w:t xml:space="preserve"> </w:t>
+      </w:r>
+      <w:r>
+        <w:t xml:space="preserve">Get the kit with</w:t>
+      </w:r>
+      <w:r>
+        <w:t xml:space="preserve"> </w:t>
+      </w:r>
+      <w:r>
+        <w:rPr>
+          <w:rStyle w:val="VerbatimChar"/>
+        </w:rPr>
+        <w:t xml:space="preserve">git clone https://github.com/kmin1223/azfiles-lab.git</w:t>
+      </w:r>
+      <w:r>
+        <w:t xml:space="preserve">,</w:t>
+      </w:r>
+      <w:r>
+        <w:t xml:space="preserve"> </w:t>
+      </w:r>
+      <w:r>
+        <w:rPr>
+          <w:rStyle w:val="VerbatimChar"/>
+        </w:rPr>
+        <w:t xml:space="preserve">cd</w:t>
+      </w:r>
+      <w:r>
+        <w:t xml:space="preserve"> </w:t>
+      </w:r>
+      <w:r>
+        <w:t xml:space="preserve">into it, and</w:t>
+      </w:r>
+      <w:r>
+        <w:t xml:space="preserve"> </w:t>
+      </w:r>
+      <w:r>
+        <w:t xml:space="preserve">skip the</w:t>
+      </w:r>
+      <w:r>
+        <w:t xml:space="preserve"> </w:t>
+      </w:r>
+      <w:r>
+        <w:rPr>
+          <w:rStyle w:val="VerbatimChar"/>
+        </w:rPr>
+        <w:t xml:space="preserve">Unblock-File</w:t>
+      </w:r>
+      <w:r>
+        <w:t xml:space="preserve"> </w:t>
+      </w:r>
+      <w:r>
+        <w:t xml:space="preserve">/</w:t>
+      </w:r>
+      <w:r>
+        <w:t xml:space="preserve"> </w:t>
+      </w:r>
+      <w:r>
+        <w:rPr>
+          <w:rStyle w:val="VerbatimChar"/>
+        </w:rPr>
+        <w:t xml:space="preserve">Set-ExecutionPolicy</w:t>
+      </w:r>
+      <w:r>
+        <w:t xml:space="preserve"> </w:t>
+      </w:r>
+      <w:r>
+        <w:t xml:space="preserve">lines below — they’re Windows-only. Type paths with</w:t>
+      </w:r>
+      <w:r>
+        <w:t xml:space="preserve"> </w:t>
+      </w:r>
+      <w:r>
+        <w:t xml:space="preserve">forward slashes (</w:t>
+      </w:r>
+      <w:r>
+        <w:rPr>
+          <w:rStyle w:val="VerbatimChar"/>
+        </w:rPr>
+        <w:t xml:space="preserve">./deploy.ps1</w:t>
+      </w:r>
+      <w:r>
+        <w:t xml:space="preserve">,</w:t>
+      </w:r>
+      <w:r>
+        <w:t xml:space="preserve"> </w:t>
+      </w:r>
+      <w:r>
+        <w:rPr>
+          <w:rStyle w:val="VerbatimChar"/>
+        </w:rPr>
+        <w:t xml:space="preserve">./faults/Invoke-Fault.ps1</w:t>
+      </w:r>
+      <w:r>
+        <w:t xml:space="preserve">). One caveat:</w:t>
+      </w:r>
+      <w:r>
+        <w:t xml:space="preserve"> </w:t>
+      </w:r>
+      <w:r>
+        <w:t xml:space="preserve">Cloud Shell disconnects after ~20 min idle; the deploy prints output the</w:t>
+      </w:r>
+      <w:r>
+        <w:t xml:space="preserve"> </w:t>
+      </w:r>
+      <w:r>
+        <w:t xml:space="preserve">whole time so it stays alive, and if it ever drops just re-run the same</w:t>
+      </w:r>
+      <w:r>
+        <w:t xml:space="preserve"> </w:t>
+      </w:r>
+      <w:r>
+        <w:t xml:space="preserve">command (it resumes safely).</w:t>
       </w:r>
     </w:p>
     <w:p>
@@ -648,6 +884,18 @@
         <w:t xml:space="preserve">Unblock-File</w:t>
       </w:r>
       <w:r>
+        <w:rPr>
+          <w:rStyle w:val="NormalTok"/>
+        </w:rPr>
+        <w:t xml:space="preserve">            </w:t>
+      </w:r>
+      <w:r>
+        <w:rPr>
+          <w:rStyle w:val="CommentTok"/>
+        </w:rPr>
+        <w:t xml:space="preserve"># local Windows only</w:t>
+      </w:r>
+      <w:r>
         <w:br/>
       </w:r>
       <w:r>
@@ -672,7 +920,13 @@
         <w:rPr>
           <w:rStyle w:val="NormalTok"/>
         </w:rPr>
-        <w:t xml:space="preserve"> -ExecutionPolicy Bypass -Force</w:t>
+        <w:t xml:space="preserve"> -ExecutionPolicy Bypass -Force   </w:t>
+      </w:r>
+      <w:r>
+        <w:rPr>
+          <w:rStyle w:val="CommentTok"/>
+        </w:rPr>
+        <w:t xml:space="preserve"># local Windows only</w:t>
       </w:r>
       <w:r>
         <w:br/>
@@ -708,6 +962,36 @@
     <w:p>
       <w:pPr>
         <w:pStyle w:val="FirstParagraph"/>
+      </w:pPr>
+      <w:r>
+        <w:rPr>
+          <w:i/>
+        </w:rPr>
+        <w:t xml:space="preserve">(In Cloud Shell, skip the first two lines and run</w:t>
+      </w:r>
+      <w:r>
+        <w:rPr>
+          <w:i/>
+        </w:rPr>
+        <w:t xml:space="preserve"> </w:t>
+      </w:r>
+      <w:r>
+        <w:rPr>
+          <w:rStyle w:val="VerbatimChar"/>
+          <w:i/>
+        </w:rPr>
+        <w:t xml:space="preserve">./deploy.ps1 …</w:t>
+      </w:r>
+      <w:r>
+        <w:rPr>
+          <w:i/>
+        </w:rPr>
+        <w:t xml:space="preserve">.)</w:t>
+      </w:r>
+    </w:p>
+    <w:p>
+      <w:pPr>
+        <w:pStyle w:val="BodyText"/>
       </w:pPr>
       <w:r>
         <w:t xml:space="preserve">Enter a lab admin password when prompted (12+ chars; avoid spaces, quotes,</w:t>
@@ -1970,7 +2254,7 @@
       <w:pPr>
         <w:numPr>
           <w:ilvl w:val="0"/>
-          <w:numId w:val="1003"/>
+          <w:numId w:val="1004"/>
         </w:numPr>
         <w:pStyle w:val="Compact"/>
       </w:pPr>
@@ -2021,7 +2305,7 @@
       <w:pPr>
         <w:numPr>
           <w:ilvl w:val="0"/>
-          <w:numId w:val="1003"/>
+          <w:numId w:val="1004"/>
         </w:numPr>
         <w:pStyle w:val="Compact"/>
       </w:pPr>
@@ -2620,6 +2904,9 @@
     <w:abstractNumId w:val="991"/>
   </w:num>
   <w:num w:numId="1003">
+    <w:abstractNumId w:val="991"/>
+  </w:num>
+  <w:num w:numId="1004">
     <w:abstractNumId w:val="991"/>
   </w:num>
 </w:numbering>

</xml_diff>

<commit_message>
decrease deploy time of session1 lab
</commit_message>
<xml_diff>
--- a/docs/participant-workbook-session1.docx
+++ b/docs/participant-workbook-session1.docx
@@ -78,32 +78,6 @@
         <w:t xml:space="preserve">(hands-on)</w:t>
       </w:r>
     </w:p>
-    <w:sdt>
-      <w:sdtPr>
-        <w:docPartObj>
-          <w:docPartGallery w:val="Table of Contents"/>
-          <w:docPartUnique/>
-        </w:docPartObj>
-      </w:sdtPr>
-      <w:sdtContent>
-        <w:p>
-          <w:pPr>
-            <w:pStyle w:val="TOCHeading"/>
-          </w:pPr>
-          <w:r>
-            <w:t xml:space="preserve">Table of Contents</w:t>
-          </w:r>
-        </w:p>
-        <w:p>
-          <w:r>
-            <w:fldChar w:fldCharType="begin" w:dirty="true"/>
-            <w:instrText xml:space="preserve">TOC \o "1-3" \h \z \u</w:instrText>
-            <w:fldChar w:fldCharType="separate"/>
-            <w:fldChar w:fldCharType="end"/>
-          </w:r>
-        </w:p>
-      </w:sdtContent>
-    </w:sdt>
     <w:p>
       <w:pPr>
         <w:pStyle w:val="Heading1"/>
@@ -1576,13 +1550,563 @@
     </w:p>
     <w:p>
       <w:pPr>
+        <w:pStyle w:val="BlockText"/>
+      </w:pPr>
+      <w:r>
+        <w:rPr>
+          <w:b/>
+        </w:rPr>
+        <w:t xml:space="preserve">If the cmdlet is</w:t>
+      </w:r>
+      <w:r>
+        <w:rPr>
+          <w:b/>
+        </w:rPr>
+        <w:t xml:space="preserve"> </w:t>
+      </w:r>
+      <w:r>
+        <w:rPr>
+          <w:b/>
+        </w:rPr>
+        <w:t xml:space="preserve">“</w:t>
+      </w:r>
+      <w:r>
+        <w:rPr>
+          <w:b/>
+        </w:rPr>
+        <w:t xml:space="preserve">found in the module AzFilesHybrid, but the module could</w:t>
+      </w:r>
+      <w:r>
+        <w:rPr>
+          <w:b/>
+        </w:rPr>
+        <w:t xml:space="preserve"> </w:t>
+      </w:r>
+      <w:r>
+        <w:rPr>
+          <w:b/>
+        </w:rPr>
+        <w:t xml:space="preserve">not be loaded</w:t>
+      </w:r>
+      <w:r>
+        <w:rPr>
+          <w:b/>
+        </w:rPr>
+        <w:t xml:space="preserve">”</w:t>
+      </w:r>
+      <w:r>
+        <w:t xml:space="preserve">, don’t trust that error — it describes the symptom, not the</w:t>
+      </w:r>
+      <w:r>
+        <w:t xml:space="preserve"> </w:t>
+      </w:r>
+      <w:r>
+        <w:t xml:space="preserve">cause. Force the import to get the real one:</w:t>
+      </w:r>
+    </w:p>
+    <w:p>
+      <w:pPr>
+        <w:pStyle w:val="SourceCode"/>
+      </w:pPr>
+      <w:r>
+        <w:rPr>
+          <w:rStyle w:val="FunctionTok"/>
+        </w:rPr>
+        <w:t xml:space="preserve">Import-Module</w:t>
+      </w:r>
+      <w:r>
+        <w:rPr>
+          <w:rStyle w:val="NormalTok"/>
+        </w:rPr>
+        <w:t xml:space="preserve"> AzFilesHybrid -Force -Verbose</w:t>
+      </w:r>
+    </w:p>
+    <w:p>
+      <w:pPr>
+        <w:pStyle w:val="BlockText"/>
+      </w:pPr>
+      <w:r>
+        <w:t xml:space="preserve">It almost always names an unmet</w:t>
+      </w:r>
+      <w:r>
+        <w:t xml:space="preserve"> </w:t>
+      </w:r>
+      <w:r>
+        <w:rPr>
+          <w:rStyle w:val="VerbatimChar"/>
+        </w:rPr>
+        <w:t xml:space="preserve">RequiredModules</w:t>
+      </w:r>
+      <w:r>
+        <w:t xml:space="preserve"> </w:t>
+      </w:r>
+      <w:r>
+        <w:t xml:space="preserve">entry, e.g. </w:t>
+      </w:r>
+      <w:r>
+        <w:rPr>
+          <w:i/>
+        </w:rPr>
+        <w:t xml:space="preserve">“</w:t>
+      </w:r>
+      <w:r>
+        <w:rPr>
+          <w:i/>
+        </w:rPr>
+        <w:t xml:space="preserve">The required</w:t>
+      </w:r>
+      <w:r>
+        <w:rPr>
+          <w:i/>
+        </w:rPr>
+        <w:t xml:space="preserve"> </w:t>
+      </w:r>
+      <w:r>
+        <w:rPr>
+          <w:i/>
+        </w:rPr>
+        <w:t xml:space="preserve">module</w:t>
+      </w:r>
+      <w:r>
+        <w:rPr>
+          <w:i/>
+        </w:rPr>
+        <w:t xml:space="preserve"> </w:t>
+      </w:r>
+      <w:r>
+        <w:rPr>
+          <w:i/>
+        </w:rPr>
+        <w:t xml:space="preserve">‘</w:t>
+      </w:r>
+      <w:r>
+        <w:rPr>
+          <w:i/>
+        </w:rPr>
+        <w:t xml:space="preserve">Az.Compute</w:t>
+      </w:r>
+      <w:r>
+        <w:rPr>
+          <w:i/>
+        </w:rPr>
+        <w:t xml:space="preserve">’</w:t>
+      </w:r>
+      <w:r>
+        <w:rPr>
+          <w:i/>
+        </w:rPr>
+        <w:t xml:space="preserve"> </w:t>
+      </w:r>
+      <w:r>
+        <w:rPr>
+          <w:i/>
+        </w:rPr>
+        <w:t xml:space="preserve">is not loaded.</w:t>
+      </w:r>
+      <w:r>
+        <w:rPr>
+          <w:i/>
+        </w:rPr>
+        <w:t xml:space="preserve">”</w:t>
+      </w:r>
+      <w:r>
+        <w:t xml:space="preserve"> </w:t>
+      </w:r>
+      <w:r>
+        <w:t xml:space="preserve">Install what it names and retry:</w:t>
+      </w:r>
+    </w:p>
+    <w:p>
+      <w:pPr>
+        <w:pStyle w:val="SourceCode"/>
+      </w:pPr>
+      <w:r>
+        <w:rPr>
+          <w:rStyle w:val="NormalTok"/>
+        </w:rPr>
+        <w:t xml:space="preserve">Install-Module Az.</w:t>
+      </w:r>
+      <w:r>
+        <w:rPr>
+          <w:rStyle w:val="FunctionTok"/>
+        </w:rPr>
+        <w:t xml:space="preserve">Compute</w:t>
+      </w:r>
+      <w:r>
+        <w:rPr>
+          <w:rStyle w:val="NormalTok"/>
+        </w:rPr>
+        <w:t xml:space="preserve"> -Scope AllUsers -Force -AllowClobber</w:t>
+      </w:r>
+      <w:r>
+        <w:br/>
+      </w:r>
+      <w:r>
+        <w:rPr>
+          <w:rStyle w:val="FunctionTok"/>
+        </w:rPr>
+        <w:t xml:space="preserve">Import-Module</w:t>
+      </w:r>
+      <w:r>
+        <w:rPr>
+          <w:rStyle w:val="NormalTok"/>
+        </w:rPr>
+        <w:t xml:space="preserve"> AzFilesHybrid -Force</w:t>
+      </w:r>
+    </w:p>
+    <w:p>
+      <w:pPr>
+        <w:pStyle w:val="BlockText"/>
+      </w:pPr>
+      <w:r>
+        <w:t xml:space="preserve">To see the whole dependency list up front:</w:t>
+      </w:r>
+    </w:p>
+    <w:p>
+      <w:pPr>
+        <w:pStyle w:val="SourceCode"/>
+      </w:pPr>
+      <w:r>
+        <w:rPr>
+          <w:rStyle w:val="NormalTok"/>
+        </w:rPr>
+        <w:t xml:space="preserve">(Import-PowerShellDataFile </w:t>
+      </w:r>
+      <w:r>
+        <w:rPr>
+          <w:rStyle w:val="StringTok"/>
+        </w:rPr>
+        <w:t xml:space="preserve">"$env:ProgramFiles\WindowsPowerShell\Modules\AzFilesHybrid\0.3.3.0\AzFilesHybrid.psd1"</w:t>
+      </w:r>
+      <w:r>
+        <w:rPr>
+          <w:rStyle w:val="NormalTok"/>
+        </w:rPr>
+        <w:t xml:space="preserve">).</w:t>
+      </w:r>
+      <w:r>
+        <w:rPr>
+          <w:rStyle w:val="FunctionTok"/>
+        </w:rPr>
+        <w:t xml:space="preserve">RequiredModules</w:t>
+      </w:r>
+    </w:p>
+    <w:p>
+      <w:pPr>
+        <w:pStyle w:val="BlockText"/>
+      </w:pPr>
+      <w:r>
+        <w:t xml:space="preserve">This is worth internalizing:</w:t>
+      </w:r>
+      <w:r>
+        <w:t xml:space="preserve"> </w:t>
+      </w:r>
+      <w:r>
+        <w:rPr>
+          <w:i/>
+        </w:rPr>
+        <w:t xml:space="preserve">“</w:t>
+      </w:r>
+      <w:r>
+        <w:rPr>
+          <w:i/>
+        </w:rPr>
+        <w:t xml:space="preserve">command not found</w:t>
+      </w:r>
+      <w:r>
+        <w:rPr>
+          <w:i/>
+        </w:rPr>
+        <w:t xml:space="preserve">”</w:t>
+      </w:r>
+      <w:r>
+        <w:t xml:space="preserve"> </w:t>
+      </w:r>
+      <w:r>
+        <w:t xml:space="preserve">on a module that is plainly</w:t>
+      </w:r>
+      <w:r>
+        <w:t xml:space="preserve"> </w:t>
+      </w:r>
+      <w:r>
+        <w:t xml:space="preserve">installed is a</w:t>
+      </w:r>
+      <w:r>
+        <w:t xml:space="preserve"> </w:t>
+      </w:r>
+      <w:r>
+        <w:rPr>
+          <w:b/>
+        </w:rPr>
+        <w:t xml:space="preserve">dependency</w:t>
+      </w:r>
+      <w:r>
+        <w:t xml:space="preserve"> </w:t>
+      </w:r>
+      <w:r>
+        <w:t xml:space="preserve">failure, not a missing-install failure. The same</w:t>
+      </w:r>
+      <w:r>
+        <w:t xml:space="preserve"> </w:t>
+      </w:r>
+      <w:r>
+        <w:t xml:space="preserve">reasoning applies to customer environments where a partial Az install breaks</w:t>
+      </w:r>
+      <w:r>
+        <w:t xml:space="preserve"> </w:t>
+      </w:r>
+      <w:r>
+        <w:t xml:space="preserve">AzFilesHybrid.</w:t>
+      </w:r>
+    </w:p>
+    <w:p>
+      <w:pPr>
+        <w:pStyle w:val="BlockText"/>
+      </w:pPr>
+      <w:r>
+        <w:rPr>
+          <w:b/>
+        </w:rPr>
+        <w:t xml:space="preserve">If</w:t>
+      </w:r>
+      <w:r>
+        <w:rPr>
+          <w:b/>
+        </w:rPr>
+        <w:t xml:space="preserve"> </w:t>
+      </w:r>
+      <w:r>
+        <w:rPr>
+          <w:rStyle w:val="VerbatimChar"/>
+          <w:b/>
+        </w:rPr>
+        <w:t xml:space="preserve">Connect-AzAccount</w:t>
+      </w:r>
+      <w:r>
+        <w:rPr>
+          <w:b/>
+        </w:rPr>
+        <w:t xml:space="preserve"> </w:t>
+      </w:r>
+      <w:r>
+        <w:rPr>
+          <w:b/>
+        </w:rPr>
+        <w:t xml:space="preserve">fails on the VM</w:t>
+      </w:r>
+      <w:r>
+        <w:t xml:space="preserve"> </w:t>
+      </w:r>
+      <w:r>
+        <w:t xml:space="preserve">with</w:t>
+      </w:r>
+      <w:r>
+        <w:t xml:space="preserve"> </w:t>
+      </w:r>
+      <w:r>
+        <w:t xml:space="preserve">“</w:t>
+      </w:r>
+      <w:r>
+        <w:t xml:space="preserve">user interaction is required</w:t>
+      </w:r>
+      <w:r>
+        <w:t xml:space="preserve">”</w:t>
+      </w:r>
+      <w:r>
+        <w:t xml:space="preserve"> </w:t>
+      </w:r>
+      <w:r>
+        <w:t xml:space="preserve">or a token error, the interactive sign-in window is being blocked. Use device</w:t>
+      </w:r>
+      <w:r>
+        <w:t xml:space="preserve"> </w:t>
+      </w:r>
+      <w:r>
+        <w:t xml:space="preserve">code instead — it prints a code you enter at</w:t>
+      </w:r>
+      <w:r>
+        <w:t xml:space="preserve"> </w:t>
+      </w:r>
+      <w:hyperlink r:id="rId25">
+        <w:r>
+          <w:rPr>
+            <w:rStyle w:val="Hyperlink"/>
+          </w:rPr>
+          <w:t xml:space="preserve">https://microsoft.com/devicelogin</w:t>
+        </w:r>
+      </w:hyperlink>
+      <w:r>
+        <w:t xml:space="preserve"> </w:t>
+      </w:r>
+      <w:r>
+        <w:t xml:space="preserve">from your own browser:</w:t>
+      </w:r>
+    </w:p>
+    <w:p>
+      <w:pPr>
+        <w:pStyle w:val="SourceCode"/>
+      </w:pPr>
+      <w:r>
+        <w:rPr>
+          <w:rStyle w:val="NormalTok"/>
+        </w:rPr>
+        <w:t xml:space="preserve">Connect-AzAccount -UseDeviceAuthentication</w:t>
+      </w:r>
+    </w:p>
+    <w:p>
+      <w:pPr>
+        <w:pStyle w:val="BlockText"/>
+      </w:pPr>
+      <w:r>
+        <w:t xml:space="preserve">Everything else in these labs (</w:t>
+      </w:r>
+      <w:r>
+        <w:rPr>
+          <w:rStyle w:val="VerbatimChar"/>
+        </w:rPr>
+        <w:t xml:space="preserve">klist</w:t>
+      </w:r>
+      <w:r>
+        <w:t xml:space="preserve">,</w:t>
+      </w:r>
+      <w:r>
+        <w:t xml:space="preserve"> </w:t>
+      </w:r>
+      <w:r>
+        <w:rPr>
+          <w:rStyle w:val="VerbatimChar"/>
+        </w:rPr>
+        <w:t xml:space="preserve">net use</w:t>
+      </w:r>
+      <w:r>
+        <w:t xml:space="preserve">, the evidence collector,</w:t>
+      </w:r>
+      <w:r>
+        <w:t xml:space="preserve"> </w:t>
+      </w:r>
+      <w:r>
+        <w:rPr>
+          <w:rStyle w:val="VerbatimChar"/>
+        </w:rPr>
+        <w:t xml:space="preserve">setspn</w:t>
+      </w:r>
+      <w:r>
+        <w:t xml:space="preserve">, event 4769) needs</w:t>
+      </w:r>
+      <w:r>
+        <w:t xml:space="preserve"> </w:t>
+      </w:r>
+      <w:r>
+        <w:rPr>
+          <w:b/>
+        </w:rPr>
+        <w:t xml:space="preserve">no</w:t>
+      </w:r>
+      <w:r>
+        <w:t xml:space="preserve"> </w:t>
+      </w:r>
+      <w:r>
+        <w:t xml:space="preserve">Azure sign-in on the VM.</w:t>
+      </w:r>
+    </w:p>
+    <w:p>
+      <w:pPr>
+        <w:pStyle w:val="BlockText"/>
+      </w:pPr>
+      <w:r>
+        <w:rPr>
+          <w:b/>
+        </w:rPr>
+        <w:t xml:space="preserve">Reading the output critically:</w:t>
+      </w:r>
+      <w:r>
+        <w:t xml:space="preserve"> </w:t>
+      </w:r>
+      <w:r>
+        <w:t xml:space="preserve">this cmdlet flags RBAC/Entra checks as</w:t>
+      </w:r>
+      <w:r>
+        <w:t xml:space="preserve"> </w:t>
+      </w:r>
+      <w:r>
+        <w:t xml:space="preserve">failures whenever your design simply doesn’t use them — our lab relies on</w:t>
+      </w:r>
+      <w:r>
+        <w:t xml:space="preserve"> </w:t>
+      </w:r>
+      <w:r>
+        <w:rPr>
+          <w:rStyle w:val="VerbatimChar"/>
+        </w:rPr>
+        <w:t xml:space="preserve">DefaultSharePermission</w:t>
+      </w:r>
+      <w:r>
+        <w:t xml:space="preserve"> </w:t>
+      </w:r>
+      <w:r>
+        <w:t xml:space="preserve">with no Entra sync, so</w:t>
+      </w:r>
+      <w:r>
+        <w:t xml:space="preserve"> </w:t>
+      </w:r>
+      <w:r>
+        <w:rPr>
+          <w:rStyle w:val="VerbatimChar"/>
+        </w:rPr>
+        <w:t xml:space="preserve">CheckSidHasAadUser</w:t>
+      </w:r>
+      <w:r>
+        <w:t xml:space="preserve"> </w:t>
+      </w:r>
+      <w:r>
+        <w:t xml:space="preserve">and</w:t>
+      </w:r>
+      <w:r>
+        <w:t xml:space="preserve"> </w:t>
+      </w:r>
+      <w:r>
+        <w:rPr>
+          <w:rStyle w:val="VerbatimChar"/>
+        </w:rPr>
+        <w:t xml:space="preserve">CheckUserRbacAssignment</w:t>
+      </w:r>
+      <w:r>
+        <w:t xml:space="preserve"> </w:t>
+      </w:r>
+      <w:r>
+        <w:t xml:space="preserve">are</w:t>
+      </w:r>
+      <w:r>
+        <w:t xml:space="preserve"> </w:t>
+      </w:r>
+      <w:r>
+        <w:rPr>
+          <w:i/>
+        </w:rPr>
+        <w:t xml:space="preserve">expected</w:t>
+      </w:r>
+      <w:r>
+        <w:t xml:space="preserve"> </w:t>
+      </w:r>
+      <w:r>
+        <w:t xml:space="preserve">to fail. Map each reported failure to</w:t>
+      </w:r>
+      <w:r>
+        <w:t xml:space="preserve"> </w:t>
+      </w:r>
+      <w:r>
+        <w:t xml:space="preserve">your design before chasing it.</w:t>
+      </w:r>
+    </w:p>
+    <w:p>
+      <w:pPr>
         <w:pStyle w:val="Heading2"/>
       </w:pPr>
-      <w:bookmarkStart w:id="25" w:name="capture-your-known-good-reference"/>
+      <w:bookmarkStart w:id="26" w:name="capture-your-known-good-reference"/>
       <w:r>
         <w:t xml:space="preserve">Capture your known-good reference</w:t>
       </w:r>
-      <w:bookmarkEnd w:id="25"/>
+      <w:bookmarkEnd w:id="26"/>
     </w:p>
     <w:p>
       <w:pPr>
@@ -1994,11 +2518,11 @@
       <w:pPr>
         <w:pStyle w:val="Heading1"/>
       </w:pPr>
-      <w:bookmarkStart w:id="26" w:name="lab-3-the-aes-256-migration"/>
+      <w:bookmarkStart w:id="27" w:name="lab-3-the-aes-256-migration"/>
       <w:r>
         <w:t xml:space="preserve">Lab 3 · The AES-256 migration ★</w:t>
       </w:r>
-      <w:bookmarkEnd w:id="26"/>
+      <w:bookmarkEnd w:id="27"/>
     </w:p>
     <w:p>
       <w:pPr>
@@ -2018,11 +2542,11 @@
       <w:pPr>
         <w:pStyle w:val="Heading2"/>
       </w:pPr>
-      <w:bookmarkStart w:id="27" w:name="step-1-look-before-you-leap"/>
+      <w:bookmarkStart w:id="28" w:name="step-1-look-before-you-leap"/>
       <w:r>
         <w:t xml:space="preserve">Step 1 — look before you leap</w:t>
       </w:r>
-      <w:bookmarkEnd w:id="27"/>
+      <w:bookmarkEnd w:id="28"/>
     </w:p>
     <w:p>
       <w:pPr>
@@ -2092,11 +2616,11 @@
       <w:pPr>
         <w:pStyle w:val="Heading2"/>
       </w:pPr>
-      <w:bookmarkStart w:id="28" w:name="step-2-perform-the-migration"/>
+      <w:bookmarkStart w:id="29" w:name="step-2-perform-the-migration"/>
       <w:r>
         <w:t xml:space="preserve">Step 2 — perform the migration</w:t>
       </w:r>
-      <w:bookmarkEnd w:id="28"/>
+      <w:bookmarkEnd w:id="29"/>
     </w:p>
     <w:p>
       <w:pPr>
@@ -2133,11 +2657,11 @@
       <w:pPr>
         <w:pStyle w:val="Heading2"/>
       </w:pPr>
-      <w:bookmarkStart w:id="29" w:name="step-3-retest-drop-sessions-first"/>
+      <w:bookmarkStart w:id="30" w:name="step-3-retest-drop-sessions-first"/>
       <w:r>
         <w:t xml:space="preserve">Step 3 — retest (drop sessions first!)</w:t>
       </w:r>
-      <w:bookmarkEnd w:id="29"/>
+      <w:bookmarkEnd w:id="30"/>
     </w:p>
     <w:p>
       <w:pPr>
@@ -2268,11 +2792,11 @@
       <w:pPr>
         <w:pStyle w:val="Heading2"/>
       </w:pPr>
-      <w:bookmarkStart w:id="30" w:name="step-4-diagnose-from-evidence"/>
+      <w:bookmarkStart w:id="31" w:name="step-4-diagnose-from-evidence"/>
       <w:r>
         <w:t xml:space="preserve">Step 4 — diagnose from evidence</w:t>
       </w:r>
-      <w:bookmarkEnd w:id="30"/>
+      <w:bookmarkEnd w:id="31"/>
     </w:p>
     <w:p>
       <w:pPr>
@@ -2531,11 +3055,11 @@
       <w:pPr>
         <w:pStyle w:val="Heading2"/>
       </w:pPr>
-      <w:bookmarkStart w:id="31" w:name="step-5-repair-in-the-right-order"/>
+      <w:bookmarkStart w:id="32" w:name="step-5-repair-in-the-right-order"/>
       <w:r>
         <w:t xml:space="preserve">Step 5 — repair, in the right order</w:t>
       </w:r>
-      <w:bookmarkEnd w:id="31"/>
+      <w:bookmarkEnd w:id="32"/>
     </w:p>
     <w:p>
       <w:pPr>
@@ -2780,11 +3304,11 @@
       <w:pPr>
         <w:pStyle w:val="Heading1"/>
       </w:pPr>
-      <w:bookmarkStart w:id="32" w:name="X2dc5c0b3521191f27bb44e783cad63fc98502e1"/>
+      <w:bookmarkStart w:id="33" w:name="X2dc5c0b3521191f27bb44e783cad63fc98502e1"/>
       <w:r>
         <w:t xml:space="preserve">Lab 4 · Access denied — with a perfect Kerberos ticket ★</w:t>
       </w:r>
-      <w:bookmarkEnd w:id="32"/>
+      <w:bookmarkEnd w:id="33"/>
     </w:p>
     <w:p>
       <w:pPr>
@@ -2825,11 +3349,11 @@
       <w:pPr>
         <w:pStyle w:val="Heading2"/>
       </w:pPr>
-      <w:bookmarkStart w:id="33" w:name="break-it"/>
+      <w:bookmarkStart w:id="34" w:name="break-it"/>
       <w:r>
         <w:t xml:space="preserve">Break it</w:t>
       </w:r>
-      <w:bookmarkEnd w:id="33"/>
+      <w:bookmarkEnd w:id="34"/>
     </w:p>
     <w:p>
       <w:pPr>
@@ -2896,11 +3420,11 @@
       <w:pPr>
         <w:pStyle w:val="Heading2"/>
       </w:pPr>
-      <w:bookmarkStart w:id="34" w:name="reproduce-client-vm"/>
+      <w:bookmarkStart w:id="35" w:name="reproduce-client-vm"/>
       <w:r>
         <w:t xml:space="preserve">Reproduce (Client VM)</w:t>
       </w:r>
-      <w:bookmarkEnd w:id="34"/>
+      <w:bookmarkEnd w:id="35"/>
     </w:p>
     <w:p>
       <w:pPr>
@@ -2976,11 +3500,11 @@
       <w:pPr>
         <w:pStyle w:val="Heading2"/>
       </w:pPr>
-      <w:bookmarkStart w:id="35" w:name="diagnose"/>
+      <w:bookmarkStart w:id="36" w:name="diagnose"/>
       <w:r>
         <w:t xml:space="preserve">Diagnose</w:t>
       </w:r>
-      <w:bookmarkEnd w:id="35"/>
+      <w:bookmarkEnd w:id="36"/>
     </w:p>
     <w:p>
       <w:pPr>
@@ -3139,11 +3663,11 @@
       <w:pPr>
         <w:pStyle w:val="Heading2"/>
       </w:pPr>
-      <w:bookmarkStart w:id="36" w:name="fix"/>
+      <w:bookmarkStart w:id="37" w:name="fix"/>
       <w:r>
         <w:t xml:space="preserve">Fix</w:t>
       </w:r>
-      <w:bookmarkEnd w:id="36"/>
+      <w:bookmarkEnd w:id="37"/>
     </w:p>
     <w:p>
       <w:pPr>
@@ -3208,11 +3732,11 @@
       <w:pPr>
         <w:pStyle w:val="Heading1"/>
       </w:pPr>
-      <w:bookmarkStart w:id="37" w:name="X92ed23674135c47bbb946c3edb44bb64bc7bb9c"/>
+      <w:bookmarkStart w:id="38" w:name="X92ed23674135c47bbb946c3edb44bb64bc7bb9c"/>
       <w:r>
         <w:t xml:space="preserve">Lab 5 · Fix a mount failure (error 1396) — different root cause</w:t>
       </w:r>
-      <w:bookmarkEnd w:id="37"/>
+      <w:bookmarkEnd w:id="38"/>
     </w:p>
     <w:p>
       <w:pPr>
@@ -3839,11 +4363,11 @@
       <w:pPr>
         <w:pStyle w:val="Heading1"/>
       </w:pPr>
-      <w:bookmarkStart w:id="38" w:name="lab-6-fix-a-broken-spn-error-0xc000018b"/>
+      <w:bookmarkStart w:id="39" w:name="lab-6-fix-a-broken-spn-error-0xc000018b"/>
       <w:r>
         <w:t xml:space="preserve">Lab 6 · Fix a broken SPN (error 0xc000018b)</w:t>
       </w:r>
-      <w:bookmarkEnd w:id="38"/>
+      <w:bookmarkEnd w:id="39"/>
     </w:p>
     <w:p>
       <w:pPr>
@@ -4102,21 +4626,21 @@
       <w:pPr>
         <w:pStyle w:val="Heading1"/>
       </w:pPr>
-      <w:bookmarkStart w:id="39" w:name="lab-7-two-quick-ones"/>
+      <w:bookmarkStart w:id="40" w:name="lab-7-two-quick-ones"/>
       <w:r>
         <w:t xml:space="preserve">Lab 7 · Two quick ones</w:t>
       </w:r>
-      <w:bookmarkEnd w:id="39"/>
+      <w:bookmarkEnd w:id="40"/>
     </w:p>
     <w:p>
       <w:pPr>
         <w:pStyle w:val="Heading2"/>
       </w:pPr>
-      <w:bookmarkStart w:id="40" w:name="a-blocked-port-445"/>
+      <w:bookmarkStart w:id="41" w:name="a-blocked-port-445"/>
       <w:r>
         <w:t xml:space="preserve">7a · Blocked port 445</w:t>
       </w:r>
-      <w:bookmarkEnd w:id="40"/>
+      <w:bookmarkEnd w:id="41"/>
     </w:p>
     <w:p>
       <w:pPr>
@@ -4258,11 +4782,11 @@
       <w:pPr>
         <w:pStyle w:val="Heading2"/>
       </w:pPr>
-      <w:bookmarkStart w:id="41" w:name="b-lost-share-level-access"/>
+      <w:bookmarkStart w:id="42" w:name="b-lost-share-level-access"/>
       <w:r>
         <w:t xml:space="preserve">7b · Lost share-level access</w:t>
       </w:r>
-      <w:bookmarkEnd w:id="41"/>
+      <w:bookmarkEnd w:id="42"/>
     </w:p>
     <w:p>
       <w:pPr>
@@ -4399,11 +4923,11 @@
       <w:pPr>
         <w:pStyle w:val="Heading1"/>
       </w:pPr>
-      <w:bookmarkStart w:id="42" w:name="X388e6b2f4e6dbe7ea8700b7813f407dbdb4d608"/>
+      <w:bookmarkStart w:id="43" w:name="X388e6b2f4e6dbe7ea8700b7813f407dbdb4d608"/>
       <w:r>
         <w:t xml:space="preserve">Optional · Advanced faults (evidence required)</w:t>
       </w:r>
-      <w:bookmarkEnd w:id="42"/>
+      <w:bookmarkEnd w:id="43"/>
     </w:p>
     <w:p>
       <w:pPr>
@@ -4653,11 +5177,11 @@
       <w:pPr>
         <w:pStyle w:val="Heading1"/>
       </w:pPr>
-      <w:bookmarkStart w:id="43" w:name="clean-up"/>
+      <w:bookmarkStart w:id="44" w:name="clean-up"/>
       <w:r>
         <w:t xml:space="preserve">Clean up</w:t>
       </w:r>
-      <w:bookmarkEnd w:id="43"/>
+      <w:bookmarkEnd w:id="44"/>
     </w:p>
     <w:p>
       <w:pPr>
@@ -4703,11 +5227,11 @@
       <w:pPr>
         <w:pStyle w:val="Heading1"/>
       </w:pPr>
-      <w:bookmarkStart w:id="44" w:name="command-reference"/>
+      <w:bookmarkStart w:id="45" w:name="command-reference"/>
       <w:r>
         <w:t xml:space="preserve">Command reference</w:t>
       </w:r>
-      <w:bookmarkEnd w:id="44"/>
+      <w:bookmarkEnd w:id="45"/>
     </w:p>
     <w:p>
       <w:pPr>
@@ -4856,11 +5380,11 @@
       <w:pPr>
         <w:pStyle w:val="Heading1"/>
       </w:pPr>
-      <w:bookmarkStart w:id="45" w:name="error-cause-quick-map"/>
+      <w:bookmarkStart w:id="46" w:name="error-cause-quick-map"/>
       <w:r>
         <w:t xml:space="preserve">Error → cause quick map</w:t>
       </w:r>
-      <w:bookmarkEnd w:id="45"/>
+      <w:bookmarkEnd w:id="46"/>
     </w:p>
     <w:tbl>
       <w:tblPr>
@@ -5550,7 +6074,7 @@
         <w:rFonts w:asciiTheme="minorHAnsi" w:eastAsiaTheme="minorHAnsi" w:hAnsiTheme="minorHAnsi" w:cstheme="minorBidi"/>
         <w:sz w:val="24"/>
         <w:szCs w:val="24"/>
-        <w:lang w:val="en" w:eastAsia="en-US" w:bidi="ar-SA"/>
+        <w:lang w:val="en-US" w:eastAsia="en-US" w:bidi="ar-SA"/>
       </w:rPr>
     </w:rPrDefault>
     <w:pPrDefault>

</xml_diff>